<commit_message>
Edits to piece 1,2,3,5,6,8 and front matter
</commit_message>
<xml_diff>
--- a/Front Matter/Template/2_Front-Matter.docx
+++ b/Front Matter/Template/2_Front-Matter.docx
@@ -5167,6 +5167,7 @@
     </w:p>
     <w:p>
       <w:pPr>
+        <w:ind w:left="288"/>
         <w:rPr>
           <w:rFonts w:ascii="Noto Serif SC" w:eastAsia="Noto Serif SC" w:hAnsi="Noto Serif SC" w:cs="Noto Serif"/>
           <w:sz w:val="20"/>
@@ -5291,6 +5292,7 @@
     </w:p>
     <w:p>
       <w:pPr>
+        <w:ind w:left="288"/>
         <w:rPr>
           <w:rFonts w:ascii="Noto Serif SC" w:eastAsia="Noto Serif SC" w:hAnsi="Noto Serif SC" w:cs="Noto Serif"/>
           <w:sz w:val="20"/>
@@ -5422,6 +5424,7 @@
     </w:p>
     <w:p>
       <w:pPr>
+        <w:ind w:left="288"/>
         <w:rPr>
           <w:rFonts w:ascii="Noto Serif SC" w:eastAsia="Noto Serif SC" w:hAnsi="Noto Serif SC" w:cs="Noto Serif"/>
           <w:sz w:val="20"/>
@@ -5550,6 +5553,7 @@
     </w:p>
     <w:p>
       <w:pPr>
+        <w:ind w:left="288"/>
         <w:rPr>
           <w:rFonts w:ascii="Noto Serif SC" w:eastAsia="Noto Serif SC" w:hAnsi="Noto Serif SC" w:cs="Noto Serif"/>
           <w:sz w:val="20"/>
@@ -5667,6 +5671,7 @@
     </w:p>
     <w:p>
       <w:pPr>
+        <w:ind w:left="288"/>
         <w:rPr>
           <w:rFonts w:ascii="Noto Serif SC" w:eastAsia="Noto Serif SC" w:hAnsi="Noto Serif SC" w:cs="Noto Serif"/>
           <w:sz w:val="20"/>

</xml_diff>

<commit_message>
Piece 2 - apostrophes
</commit_message>
<xml_diff>
--- a/Front Matter/Template/2_Front-Matter.docx
+++ b/Front Matter/Template/2_Front-Matter.docx
@@ -2482,7 +2482,35 @@
           <w:rFonts w:ascii="Noto Serif SC" w:eastAsia="Noto Serif SC" w:hAnsi="Noto Serif SC"/>
           <w:lang w:eastAsia="zh-TW"/>
         </w:rPr>
-        <w:t>Born in Hong Kong and now living in U.S.A. He received his Doctor of Musical Arts (D.M.A.) at Rice University and Bachelor of Fine Arts (B.F.A.) at the Hong Kong Academy for Performing Arts. He has attended major music festivals including: Wellesley Composers Conference, Aspen Music Festival, International Summer Course for New Music Darmstadt, Asian Composers’ League, ISCM World Music Days, Chinese Composers’ Festival, Music X, June in Buffalo, IMPULS Ensemble Akademie, California E.A.R. Unit Composer Seminar, the 13th International Summer Program, Czech Republic, International Composers’ Workshop, Luxembourg, the International Summer Course for New Music, Darmstadt, Germany, Wellesley Composers’ Conference. Residencies include: the Atlantic Center for the Arts, Florida, Kimmel Harding Nelson Center for the Arts, Nebraska, Virginia Center for the Creative Arts, Yaddo Colony, NY and the MacDowell Colony, NH.</w:t>
+        <w:t>Born in Hong Kong and now living in U.S.A. He received his Doctor of Musical Arts (D.M.A.) at Rice University and Bachelor of Fine Arts (B.F.A.) at the Hong Kong Academy for Performing Arts. He has attended major music festivals including: Wellesley Composers Conference, Aspen Music Festival, International Summer Course for New Music Darmstadt, Asian Composers</w:t>
+      </w:r>
+      <w:r>
+        <w:rPr>
+          <w:rFonts w:ascii="Noto Serif SC" w:eastAsia="Noto Serif SC" w:hAnsi="Noto Serif SC"/>
+          <w:lang w:eastAsia="zh-TW"/>
+        </w:rPr>
+        <w:t xml:space="preserve">' </w:t>
+      </w:r>
+      <w:r>
+        <w:rPr>
+          <w:rFonts w:ascii="Noto Serif SC" w:eastAsia="Noto Serif SC" w:hAnsi="Noto Serif SC"/>
+          <w:lang w:eastAsia="zh-TW"/>
+        </w:rPr>
+        <w:t>League, ISCM World Music Days, Chinese Composers</w:t>
+      </w:r>
+      <w:r>
+        <w:rPr>
+          <w:rFonts w:ascii="Noto Serif SC" w:eastAsia="Noto Serif SC" w:hAnsi="Noto Serif SC"/>
+          <w:lang w:eastAsia="zh-TW"/>
+        </w:rPr>
+        <w:t xml:space="preserve">' </w:t>
+      </w:r>
+      <w:r>
+        <w:rPr>
+          <w:rFonts w:ascii="Noto Serif SC" w:eastAsia="Noto Serif SC" w:hAnsi="Noto Serif SC"/>
+          <w:lang w:eastAsia="zh-TW"/>
+        </w:rPr>
+        <w:t>Festival, Music X, June in Buffalo, IMPULS Ensemble Akademie, California E.A.R. Unit Composer Seminar, the 13th International Summer Program, Czech Republic, International Composers’ Workshop, Luxembourg, the International Summer Course for New Music, Darmstadt, Germany, Wellesley Composers’ Conference. Residencies include: the Atlantic Center for the Arts, Florida, Kimmel Harding Nelson Center for the Arts, Nebraska, Virginia Center for the Creative Arts, Yaddo Colony, NY and the MacDowell Colony, NH.</w:t>
       </w:r>
     </w:p>
     <w:p>
@@ -2503,10 +2531,10 @@
       </w:r>
       <w:r>
         <w:rPr>
-          <w:rFonts w:ascii="Noto Serif" w:eastAsia="Noto Serif SC" w:hAnsi="Noto Serif" w:cs="Noto Serif"/>
-          <w:lang w:eastAsia="zh-TW"/>
-        </w:rPr>
-        <w:t>’</w:t>
+          <w:rFonts w:ascii="Noto Serif SC" w:eastAsia="Noto Serif SC" w:hAnsi="Noto Serif SC" w:cs="Noto Serif"/>
+          <w:lang w:eastAsia="zh-TW"/>
+        </w:rPr>
+        <w:t>'</w:t>
       </w:r>
       <w:r>
         <w:rPr>
@@ -2545,7 +2573,21 @@
           <w:rFonts w:ascii="Noto Serif SC" w:eastAsia="Noto Serif SC" w:hAnsi="Noto Serif SC"/>
           <w:lang w:eastAsia="zh-TW"/>
         </w:rPr>
-        <w:t xml:space="preserve"> Memorial Composition Award”, “Taiwan Music Center International Composition Prize”, “Robert Avalon International Prize”, “Singapore International Composition Competition for Chinese Orchestra”, “Haifa International Composition Prize”, First International EPICMUSIC Composition Prize, Italy, International Biennial composition competition, the Debussy Trio Music Foundation, Molinari Quartet’s Third International Composition Competition, the St. Paul Chamber Orchestra Emerging, the ALEA III composition Competition, the fourth NACUSA Texas Composition Competition, the International Music Prize for Excellence </w:t>
+        <w:t xml:space="preserve"> Memorial Composition Award”, “Taiwan Music Center International Composition Prize”, “Robert Avalon International Prize”, “Singapore International Composition Competition for Chinese Orchestra”, “Haifa International Composition Prize”, First International EPICMUSIC Composition Prize, Italy, International Biennial composition competition, the Debussy Trio Music Foundation, Molinari Quartet</w:t>
+      </w:r>
+      <w:r>
+        <w:rPr>
+          <w:rFonts w:ascii="Noto Serif SC" w:eastAsia="Noto Serif SC" w:hAnsi="Noto Serif SC"/>
+          <w:lang w:eastAsia="zh-TW"/>
+        </w:rPr>
+        <w:t>'</w:t>
+      </w:r>
+      <w:r>
+        <w:rPr>
+          <w:rFonts w:ascii="Noto Serif SC" w:eastAsia="Noto Serif SC" w:hAnsi="Noto Serif SC"/>
+          <w:lang w:eastAsia="zh-TW"/>
+        </w:rPr>
+        <w:t xml:space="preserve">s Third International Composition Competition, the St. Paul Chamber Orchestra Emerging, the ALEA III composition Competition, the fourth NACUSA Texas Composition Competition, the International Music Prize for Excellence in </w:t>
       </w:r>
       <w:r>
         <w:rPr>
@@ -2553,7 +2595,7 @@
           <w:lang w:eastAsia="zh-TW"/>
         </w:rPr>
         <w:lastRenderedPageBreak/>
-        <w:t>in Composition 2010, by the National Academy of Music, Thessaloniki, Greece, and the 2010 Alvarez Chamber Orchestra Freestyle Composition Competition, London, England .</w:t>
+        <w:t>Composition 2010, by the National Academy of Music, Thessaloniki, Greece, and the 2010 Alvarez Chamber Orchestra Freestyle Composition Competition, London, England .</w:t>
       </w:r>
     </w:p>
     <w:p>

</xml_diff>

<commit_message>
Score 2 & 7: "Keyed" removed from Suona
</commit_message>
<xml_diff>
--- a/Front Matter/Template/2_Front-Matter.docx
+++ b/Front Matter/Template/2_Front-Matter.docx
@@ -1527,15 +1527,15 @@
           <w:rFonts w:ascii="Noto Serif SC" w:eastAsia="Noto Serif SC" w:hAnsi="Noto Serif SC" w:cs="Noto Serif"/>
           <w:sz w:val="20"/>
           <w:szCs w:val="20"/>
-          <w:lang w:val="en-US"/>
-        </w:rPr>
-      </w:pPr>
-      <w:r>
-        <w:rPr>
-          <w:rFonts w:ascii="Noto Serif SC" w:eastAsia="Noto Serif SC" w:hAnsi="Noto Serif SC" w:cs="Noto Serif"/>
-          <w:sz w:val="20"/>
-          <w:szCs w:val="20"/>
-          <w:lang w:val="en-US"/>
+          <w:lang w:val="en-US" w:eastAsia="zh-TW"/>
+        </w:rPr>
+      </w:pPr>
+      <w:r>
+        <w:rPr>
+          <w:rFonts w:ascii="Noto Serif SC" w:eastAsia="Noto Serif SC" w:hAnsi="Noto Serif SC" w:cs="Noto Serif"/>
+          <w:sz w:val="20"/>
+          <w:szCs w:val="20"/>
+          <w:lang w:val="en-US" w:eastAsia="zh-TW"/>
         </w:rPr>
         <w:t>电话</w:t>
       </w:r>
@@ -1544,7 +1544,7 @@
           <w:rFonts w:ascii="Noto Serif SC" w:eastAsia="Noto Serif SC" w:hAnsi="Noto Serif SC" w:cs="Noto Serif"/>
           <w:sz w:val="20"/>
           <w:szCs w:val="20"/>
-          <w:lang w:val="en-US"/>
+          <w:lang w:val="en-US" w:eastAsia="zh-TW"/>
         </w:rPr>
         <w:t xml:space="preserve"> </w:t>
       </w:r>
@@ -1553,7 +1553,7 @@
           <w:rFonts w:ascii="Noto Serif SC" w:eastAsia="Noto Serif SC" w:hAnsi="Noto Serif SC" w:cs="Noto Serif"/>
           <w:sz w:val="20"/>
           <w:szCs w:val="20"/>
-          <w:lang w:val="en-US"/>
+          <w:lang w:val="en-US" w:eastAsia="zh-TW"/>
         </w:rPr>
         <w:t>Telephone: (65) 6557 4026</w:t>
       </w:r>
@@ -1579,7 +1579,7 @@
           <w:rFonts w:ascii="Noto Serif SC" w:eastAsia="Noto Serif SC" w:hAnsi="Noto Serif SC" w:cs="Noto Serif"/>
           <w:sz w:val="20"/>
           <w:szCs w:val="20"/>
-          <w:lang w:val="en-US"/>
+          <w:lang w:val="en-US" w:eastAsia="zh-TW"/>
         </w:rPr>
         <w:t>传真</w:t>
       </w:r>
@@ -1588,7 +1588,7 @@
           <w:rFonts w:ascii="Noto Serif SC" w:eastAsia="Noto Serif SC" w:hAnsi="Noto Serif SC" w:cs="Noto Serif"/>
           <w:sz w:val="20"/>
           <w:szCs w:val="20"/>
-          <w:lang w:val="en-US"/>
+          <w:lang w:val="en-US" w:eastAsia="zh-TW"/>
         </w:rPr>
         <w:t xml:space="preserve"> </w:t>
       </w:r>
@@ -1597,7 +1597,7 @@
           <w:rFonts w:ascii="Noto Serif SC" w:eastAsia="Noto Serif SC" w:hAnsi="Noto Serif SC" w:cs="Noto Serif"/>
           <w:sz w:val="20"/>
           <w:szCs w:val="20"/>
-          <w:lang w:val="en-US"/>
+          <w:lang w:val="en-US" w:eastAsia="zh-TW"/>
         </w:rPr>
         <w:t>Fax: (65) 6557 2756</w:t>
       </w:r>
@@ -2132,19 +2132,8 @@
           <w:szCs w:val="24"/>
           <w:lang w:eastAsia="zh-TW"/>
         </w:rPr>
-        <w:t xml:space="preserve">Ensemble El Perro </w:t>
-      </w:r>
-      <w:proofErr w:type="spellStart"/>
-      <w:r>
-        <w:rPr>
-          <w:rFonts w:ascii="Noto Serif SC" w:eastAsia="Noto Serif SC" w:hAnsi="Noto Serif SC"/>
-          <w:sz w:val="24"/>
-          <w:szCs w:val="24"/>
-          <w:lang w:eastAsia="zh-TW"/>
-        </w:rPr>
-        <w:t>Andaluz</w:t>
-      </w:r>
-      <w:proofErr w:type="spellEnd"/>
+        <w:t>Ensemble El Perro Andaluz</w:t>
+      </w:r>
       <w:r>
         <w:rPr>
           <w:rFonts w:ascii="Noto Serif SC" w:eastAsia="Noto Serif SC" w:hAnsi="Noto Serif SC" w:hint="eastAsia"/>
@@ -2640,23 +2629,7 @@
           <w:rFonts w:ascii="Noto Serif SC" w:eastAsia="Noto Serif SC" w:hAnsi="Noto Serif SC"/>
           <w:lang w:eastAsia="zh-TW"/>
         </w:rPr>
-        <w:t xml:space="preserve">Salvatore </w:t>
-      </w:r>
-      <w:proofErr w:type="spellStart"/>
-      <w:r>
-        <w:rPr>
-          <w:rFonts w:ascii="Noto Serif SC" w:eastAsia="Noto Serif SC" w:hAnsi="Noto Serif SC"/>
-          <w:lang w:eastAsia="zh-TW"/>
-        </w:rPr>
-        <w:t>Martirano</w:t>
-      </w:r>
-      <w:proofErr w:type="spellEnd"/>
-      <w:r>
-        <w:rPr>
-          <w:rFonts w:ascii="Noto Serif SC" w:eastAsia="Noto Serif SC" w:hAnsi="Noto Serif SC"/>
-          <w:lang w:eastAsia="zh-TW"/>
-        </w:rPr>
-        <w:t xml:space="preserve"> Memorial Composition Award</w:t>
+        <w:t>Salvatore Martirano Memorial Composition Award</w:t>
       </w:r>
       <w:r>
         <w:rPr>
@@ -4494,6 +4467,70 @@
         </w:rPr>
         <w:t xml:space="preserve">1 </w:t>
       </w:r>
+      <w:r>
+        <w:rPr>
+          <w:rFonts w:ascii="Noto Serif SC" w:eastAsia="Noto Serif SC" w:hAnsi="Noto Serif SC" w:cs="Noto Serif"/>
+          <w:sz w:val="24"/>
+          <w:szCs w:val="24"/>
+          <w:lang w:val="en-GB" w:eastAsia="zh-TW"/>
+        </w:rPr>
+        <w:t>Diyin Sheng</w:t>
+      </w:r>
+    </w:p>
+    <w:p>
+      <w:pPr>
+        <w:rPr>
+          <w:rFonts w:ascii="Noto Serif SC" w:eastAsia="Noto Serif SC" w:hAnsi="Noto Serif SC" w:cs="Noto Serif"/>
+          <w:sz w:val="24"/>
+          <w:szCs w:val="24"/>
+          <w:lang w:val="en-GB"/>
+        </w:rPr>
+      </w:pPr>
+      <w:r>
+        <w:rPr>
+          <w:rFonts w:ascii="Noto Serif SC" w:eastAsia="Noto Serif SC" w:hAnsi="Noto Serif SC" w:cs="Noto Serif"/>
+          <w:sz w:val="24"/>
+          <w:szCs w:val="24"/>
+          <w:lang w:val="en-GB" w:eastAsia="zh-TW"/>
+        </w:rPr>
+        <w:t>1</w:t>
+      </w:r>
+      <w:r>
+        <w:rPr>
+          <w:rFonts w:ascii="Noto Serif SC" w:eastAsia="Noto Serif SC" w:hAnsi="Noto Serif SC" w:cs="Noto Serif" w:hint="eastAsia"/>
+          <w:sz w:val="24"/>
+          <w:szCs w:val="24"/>
+          <w:lang w:val="en-GB" w:eastAsia="zh-TW"/>
+        </w:rPr>
+        <w:t>高音嗩</w:t>
+      </w:r>
+      <w:r>
+        <w:rPr>
+          <w:rFonts w:ascii="Noto Serif SC" w:eastAsia="Noto Serif SC" w:hAnsi="Noto Serif SC" w:cs="Noto Serif" w:hint="eastAsia"/>
+          <w:sz w:val="24"/>
+          <w:szCs w:val="24"/>
+          <w:lang w:val="en-US" w:eastAsia="zh-TW"/>
+        </w:rPr>
+        <w:t>吶</w:t>
+      </w:r>
+      <w:r>
+        <w:rPr>
+          <w:rFonts w:ascii="Noto Serif SC" w:eastAsia="Noto Serif SC" w:hAnsi="Noto Serif SC" w:cs="Noto Serif"/>
+          <w:sz w:val="24"/>
+          <w:szCs w:val="24"/>
+          <w:lang w:val="en-GB" w:eastAsia="zh-TW"/>
+        </w:rPr>
+        <w:t xml:space="preserve"> </w:t>
+      </w:r>
+      <w:r>
+        <w:rPr>
+          <w:rFonts w:ascii="Noto Serif SC" w:eastAsia="Noto Serif SC" w:hAnsi="Noto Serif SC" w:cs="Noto Serif"/>
+          <w:sz w:val="24"/>
+          <w:szCs w:val="24"/>
+          <w:lang w:val="en-GB" w:eastAsia="zh-TW"/>
+        </w:rPr>
+        <w:t xml:space="preserve">1 </w:t>
+      </w:r>
       <w:proofErr w:type="spellStart"/>
       <w:r>
         <w:rPr>
@@ -4502,7 +4539,7 @@
           <w:szCs w:val="24"/>
           <w:lang w:val="en-GB" w:eastAsia="zh-TW"/>
         </w:rPr>
-        <w:t>Diyin</w:t>
+        <w:t>Gaoyin</w:t>
       </w:r>
       <w:proofErr w:type="spellEnd"/>
       <w:r>
@@ -4512,24 +4549,35 @@
           <w:szCs w:val="24"/>
           <w:lang w:val="en-GB" w:eastAsia="zh-TW"/>
         </w:rPr>
-        <w:t xml:space="preserve"> Sheng</w:t>
-      </w:r>
-    </w:p>
-    <w:p>
-      <w:pPr>
-        <w:rPr>
-          <w:rFonts w:ascii="Noto Serif SC" w:eastAsia="Noto Serif SC" w:hAnsi="Noto Serif SC" w:cs="Noto Serif"/>
-          <w:sz w:val="24"/>
-          <w:szCs w:val="24"/>
-          <w:lang w:val="en-GB"/>
-        </w:rPr>
-      </w:pPr>
-      <w:r>
-        <w:rPr>
-          <w:rFonts w:ascii="Noto Serif SC" w:eastAsia="Noto Serif SC" w:hAnsi="Noto Serif SC" w:cs="Noto Serif"/>
-          <w:sz w:val="24"/>
-          <w:szCs w:val="24"/>
-          <w:lang w:val="en-GB" w:eastAsia="zh-TW"/>
+        <w:t xml:space="preserve"> </w:t>
+      </w:r>
+      <w:proofErr w:type="spellStart"/>
+      <w:r>
+        <w:rPr>
+          <w:rFonts w:ascii="Noto Serif SC" w:eastAsia="Noto Serif SC" w:hAnsi="Noto Serif SC" w:cs="Noto Serif"/>
+          <w:sz w:val="24"/>
+          <w:szCs w:val="24"/>
+          <w:lang w:val="en-GB" w:eastAsia="zh-TW"/>
+        </w:rPr>
+        <w:t>Suona</w:t>
+      </w:r>
+      <w:proofErr w:type="spellEnd"/>
+    </w:p>
+    <w:p>
+      <w:pPr>
+        <w:rPr>
+          <w:rFonts w:ascii="Noto Serif SC" w:eastAsia="Noto Serif SC" w:hAnsi="Noto Serif SC" w:cs="Noto Serif"/>
+          <w:sz w:val="24"/>
+          <w:szCs w:val="24"/>
+          <w:lang w:val="en-US"/>
+        </w:rPr>
+      </w:pPr>
+      <w:r>
+        <w:rPr>
+          <w:rFonts w:ascii="Noto Serif SC" w:eastAsia="Noto Serif SC" w:hAnsi="Noto Serif SC" w:cs="Noto Serif"/>
+          <w:sz w:val="24"/>
+          <w:szCs w:val="24"/>
+          <w:lang w:val="en-US" w:eastAsia="zh-TW"/>
         </w:rPr>
         <w:t>1</w:t>
       </w:r>
@@ -4538,9 +4586,77 @@
           <w:rFonts w:ascii="Noto Serif SC" w:eastAsia="Noto Serif SC" w:hAnsi="Noto Serif SC" w:cs="Noto Serif" w:hint="eastAsia"/>
           <w:sz w:val="24"/>
           <w:szCs w:val="24"/>
-          <w:lang w:val="en-GB" w:eastAsia="zh-TW"/>
-        </w:rPr>
-        <w:t>高音嗩</w:t>
+          <w:lang w:val="en-US" w:eastAsia="zh-TW"/>
+        </w:rPr>
+        <w:t>中音嗩吶</w:t>
+      </w:r>
+      <w:r>
+        <w:rPr>
+          <w:rFonts w:ascii="Noto Serif SC" w:eastAsia="Noto Serif SC" w:hAnsi="Noto Serif SC" w:cs="Noto Serif"/>
+          <w:sz w:val="24"/>
+          <w:szCs w:val="24"/>
+          <w:lang w:val="en-US" w:eastAsia="zh-TW"/>
+        </w:rPr>
+        <w:t xml:space="preserve"> </w:t>
+      </w:r>
+      <w:r>
+        <w:rPr>
+          <w:rFonts w:ascii="Noto Serif SC" w:eastAsia="Noto Serif SC" w:hAnsi="Noto Serif SC" w:cs="Noto Serif"/>
+          <w:sz w:val="24"/>
+          <w:szCs w:val="24"/>
+          <w:lang w:val="en-US" w:eastAsia="zh-TW"/>
+        </w:rPr>
+        <w:t xml:space="preserve">1 </w:t>
+      </w:r>
+      <w:proofErr w:type="spellStart"/>
+      <w:r>
+        <w:rPr>
+          <w:rFonts w:ascii="Noto Serif SC" w:eastAsia="Noto Serif SC" w:hAnsi="Noto Serif SC" w:cs="Noto Serif"/>
+          <w:sz w:val="24"/>
+          <w:szCs w:val="24"/>
+          <w:lang w:val="en-US" w:eastAsia="zh-TW"/>
+        </w:rPr>
+        <w:t>Zhongyin</w:t>
+      </w:r>
+      <w:proofErr w:type="spellEnd"/>
+      <w:r>
+        <w:rPr>
+          <w:rFonts w:ascii="Noto Serif SC" w:eastAsia="Noto Serif SC" w:hAnsi="Noto Serif SC" w:cs="Noto Serif"/>
+          <w:sz w:val="24"/>
+          <w:szCs w:val="24"/>
+          <w:lang w:val="en-US" w:eastAsia="zh-TW"/>
+        </w:rPr>
+        <w:t xml:space="preserve"> </w:t>
+      </w:r>
+      <w:proofErr w:type="spellStart"/>
+      <w:r>
+        <w:rPr>
+          <w:rFonts w:ascii="Noto Serif SC" w:eastAsia="Noto Serif SC" w:hAnsi="Noto Serif SC" w:cs="Noto Serif"/>
+          <w:sz w:val="24"/>
+          <w:szCs w:val="24"/>
+          <w:lang w:val="en-US" w:eastAsia="zh-TW"/>
+        </w:rPr>
+        <w:t>Suona</w:t>
+      </w:r>
+      <w:proofErr w:type="spellEnd"/>
+    </w:p>
+    <w:p>
+      <w:pPr>
+        <w:rPr>
+          <w:rFonts w:ascii="Noto Serif SC" w:eastAsia="Noto Serif SC" w:hAnsi="Noto Serif SC" w:cs="Noto Serif"/>
+          <w:sz w:val="24"/>
+          <w:szCs w:val="24"/>
+          <w:lang w:val="en-US"/>
+        </w:rPr>
+      </w:pPr>
+      <w:r>
+        <w:rPr>
+          <w:rFonts w:ascii="Noto Serif SC" w:eastAsia="Noto Serif SC" w:hAnsi="Noto Serif SC" w:cs="Noto Serif"/>
+          <w:sz w:val="24"/>
+          <w:szCs w:val="24"/>
+          <w:lang w:val="en-US" w:eastAsia="zh-TW"/>
+        </w:rPr>
+        <w:t>1</w:t>
       </w:r>
       <w:r>
         <w:rPr>
@@ -4549,14 +4665,14 @@
           <w:szCs w:val="24"/>
           <w:lang w:val="en-US" w:eastAsia="zh-TW"/>
         </w:rPr>
-        <w:t>吶</w:t>
-      </w:r>
-      <w:r>
-        <w:rPr>
-          <w:rFonts w:ascii="Noto Serif SC" w:eastAsia="Noto Serif SC" w:hAnsi="Noto Serif SC" w:cs="Noto Serif"/>
-          <w:sz w:val="24"/>
-          <w:szCs w:val="24"/>
-          <w:lang w:val="en-GB" w:eastAsia="zh-TW"/>
+        <w:t>次中嗩吶</w:t>
+      </w:r>
+      <w:r>
+        <w:rPr>
+          <w:rFonts w:ascii="Noto Serif SC" w:eastAsia="Noto Serif SC" w:hAnsi="Noto Serif SC" w:cs="Noto Serif"/>
+          <w:sz w:val="24"/>
+          <w:szCs w:val="24"/>
+          <w:lang w:val="en-US" w:eastAsia="zh-TW"/>
         </w:rPr>
         <w:t xml:space="preserve"> </w:t>
       </w:r>
@@ -4565,7 +4681,7 @@
           <w:rFonts w:ascii="Noto Serif SC" w:eastAsia="Noto Serif SC" w:hAnsi="Noto Serif SC" w:cs="Noto Serif"/>
           <w:sz w:val="24"/>
           <w:szCs w:val="24"/>
-          <w:lang w:val="en-GB" w:eastAsia="zh-TW"/>
+          <w:lang w:val="en-US" w:eastAsia="zh-TW"/>
         </w:rPr>
         <w:t xml:space="preserve">1 </w:t>
       </w:r>
@@ -4575,9 +4691,9 @@
           <w:rFonts w:ascii="Noto Serif SC" w:eastAsia="Noto Serif SC" w:hAnsi="Noto Serif SC" w:cs="Noto Serif"/>
           <w:sz w:val="24"/>
           <w:szCs w:val="24"/>
-          <w:lang w:val="en-GB" w:eastAsia="zh-TW"/>
-        </w:rPr>
-        <w:t>Gaoyin</w:t>
+          <w:lang w:eastAsia="zh-TW"/>
+        </w:rPr>
+        <w:t>Cizhongyin</w:t>
       </w:r>
       <w:proofErr w:type="spellEnd"/>
       <w:r>
@@ -4585,7 +4701,7 @@
           <w:rFonts w:ascii="Noto Serif SC" w:eastAsia="Noto Serif SC" w:hAnsi="Noto Serif SC" w:cs="Noto Serif"/>
           <w:sz w:val="24"/>
           <w:szCs w:val="24"/>
-          <w:lang w:val="en-GB" w:eastAsia="zh-TW"/>
+          <w:lang w:eastAsia="zh-TW"/>
         </w:rPr>
         <w:t xml:space="preserve"> </w:t>
       </w:r>
@@ -4595,7 +4711,7 @@
           <w:rFonts w:ascii="Noto Serif SC" w:eastAsia="Noto Serif SC" w:hAnsi="Noto Serif SC" w:cs="Noto Serif"/>
           <w:sz w:val="24"/>
           <w:szCs w:val="24"/>
-          <w:lang w:val="en-GB" w:eastAsia="zh-TW"/>
+          <w:lang w:val="en-US" w:eastAsia="zh-TW"/>
         </w:rPr>
         <w:t>Suona</w:t>
       </w:r>
@@ -4624,16 +4740,16 @@
           <w:rFonts w:ascii="Noto Serif SC" w:eastAsia="Noto Serif SC" w:hAnsi="Noto Serif SC" w:cs="Noto Serif" w:hint="eastAsia"/>
           <w:sz w:val="24"/>
           <w:szCs w:val="24"/>
-          <w:lang w:val="en-US" w:eastAsia="zh-TW"/>
-        </w:rPr>
-        <w:t>加鍵中音嗩吶</w:t>
-      </w:r>
-      <w:r>
-        <w:rPr>
-          <w:rFonts w:ascii="Noto Serif SC" w:eastAsia="Noto Serif SC" w:hAnsi="Noto Serif SC" w:cs="Noto Serif"/>
-          <w:sz w:val="24"/>
-          <w:szCs w:val="24"/>
-          <w:lang w:val="en-US" w:eastAsia="zh-TW"/>
+          <w:lang w:eastAsia="zh-TW"/>
+        </w:rPr>
+        <w:t>低音嗩吶</w:t>
+      </w:r>
+      <w:r>
+        <w:rPr>
+          <w:rFonts w:ascii="Noto Serif SC" w:eastAsia="Noto Serif SC" w:hAnsi="Noto Serif SC" w:cs="Noto Serif"/>
+          <w:sz w:val="24"/>
+          <w:szCs w:val="24"/>
+          <w:lang w:eastAsia="zh-TW"/>
         </w:rPr>
         <w:t xml:space="preserve"> </w:t>
       </w:r>
@@ -4644,7 +4760,55 @@
           <w:szCs w:val="24"/>
           <w:lang w:val="en-US" w:eastAsia="zh-TW"/>
         </w:rPr>
-        <w:t>1 Keyed</w:t>
+        <w:t xml:space="preserve">1 </w:t>
+      </w:r>
+      <w:r>
+        <w:rPr>
+          <w:rFonts w:ascii="Noto Serif SC" w:eastAsia="Noto Serif SC" w:hAnsi="Noto Serif SC" w:cs="Noto Serif"/>
+          <w:sz w:val="24"/>
+          <w:szCs w:val="24"/>
+          <w:lang w:eastAsia="zh-TW"/>
+        </w:rPr>
+        <w:t xml:space="preserve">Diyin </w:t>
+      </w:r>
+      <w:proofErr w:type="spellStart"/>
+      <w:r>
+        <w:rPr>
+          <w:rFonts w:ascii="Noto Serif SC" w:eastAsia="Noto Serif SC" w:hAnsi="Noto Serif SC" w:cs="Noto Serif"/>
+          <w:sz w:val="24"/>
+          <w:szCs w:val="24"/>
+          <w:lang w:eastAsia="zh-TW"/>
+        </w:rPr>
+        <w:t>Suona</w:t>
+      </w:r>
+      <w:proofErr w:type="spellEnd"/>
+    </w:p>
+    <w:p>
+      <w:pPr>
+        <w:rPr>
+          <w:rFonts w:ascii="Noto Serif SC" w:eastAsia="Noto Serif SC" w:hAnsi="Noto Serif SC" w:cs="Noto Serif"/>
+          <w:sz w:val="24"/>
+          <w:szCs w:val="24"/>
+          <w:lang w:val="en-US"/>
+        </w:rPr>
+      </w:pPr>
+      <w:r>
+        <w:rPr>
+          <w:rFonts w:ascii="Noto Serif SC" w:eastAsia="Noto Serif SC" w:hAnsi="Noto Serif SC" w:cs="Noto Serif"/>
+          <w:sz w:val="24"/>
+          <w:szCs w:val="24"/>
+          <w:lang w:val="en-US" w:eastAsia="zh-TW"/>
+        </w:rPr>
+        <w:t>1</w:t>
+      </w:r>
+      <w:r>
+        <w:rPr>
+          <w:rFonts w:ascii="Noto Serif SC" w:eastAsia="Noto Serif SC" w:hAnsi="Noto Serif SC" w:cs="Noto Serif" w:hint="eastAsia"/>
+          <w:sz w:val="24"/>
+          <w:szCs w:val="24"/>
+          <w:lang w:val="en-US" w:eastAsia="zh-TW"/>
+        </w:rPr>
+        <w:t>管</w:t>
       </w:r>
       <w:r>
         <w:rPr>
@@ -4655,6 +4819,144 @@
         </w:rPr>
         <w:t xml:space="preserve"> </w:t>
       </w:r>
+      <w:r>
+        <w:rPr>
+          <w:rFonts w:ascii="Noto Serif SC" w:eastAsia="Noto Serif SC" w:hAnsi="Noto Serif SC" w:cs="Noto Serif"/>
+          <w:sz w:val="24"/>
+          <w:szCs w:val="24"/>
+          <w:lang w:val="en-US" w:eastAsia="zh-TW"/>
+        </w:rPr>
+        <w:t xml:space="preserve">1 </w:t>
+      </w:r>
+      <w:r>
+        <w:rPr>
+          <w:rFonts w:ascii="Noto Serif SC" w:eastAsia="Noto Serif SC" w:hAnsi="Noto Serif SC" w:cs="Noto Serif"/>
+          <w:sz w:val="24"/>
+          <w:szCs w:val="24"/>
+          <w:lang w:val="en-US" w:eastAsia="zh-TW"/>
+        </w:rPr>
+        <w:t>Guan</w:t>
+      </w:r>
+    </w:p>
+    <w:p>
+      <w:pPr>
+        <w:rPr>
+          <w:rFonts w:ascii="Noto Serif SC" w:eastAsia="Noto Serif SC" w:hAnsi="Noto Serif SC" w:cs="Noto Serif"/>
+          <w:sz w:val="24"/>
+          <w:szCs w:val="24"/>
+          <w:lang w:val="en-US"/>
+        </w:rPr>
+      </w:pPr>
+    </w:p>
+    <w:p>
+      <w:pPr>
+        <w:rPr>
+          <w:rFonts w:ascii="Noto Serif SC" w:eastAsia="Noto Serif SC" w:hAnsi="Noto Serif SC" w:cs="Noto Serif"/>
+          <w:sz w:val="24"/>
+          <w:szCs w:val="24"/>
+          <w:lang w:val="en-US"/>
+        </w:rPr>
+      </w:pPr>
+      <w:r>
+        <w:rPr>
+          <w:rFonts w:ascii="Noto Serif SC" w:eastAsia="Noto Serif SC" w:hAnsi="Noto Serif SC" w:cs="Noto Serif"/>
+          <w:sz w:val="24"/>
+          <w:szCs w:val="24"/>
+          <w:lang w:val="en-US" w:eastAsia="zh-TW"/>
+        </w:rPr>
+        <w:t>1</w:t>
+      </w:r>
+      <w:r>
+        <w:rPr>
+          <w:rFonts w:ascii="Noto Serif SC" w:eastAsia="Noto Serif SC" w:hAnsi="Noto Serif SC" w:cs="Noto Serif" w:hint="eastAsia"/>
+          <w:sz w:val="24"/>
+          <w:szCs w:val="24"/>
+          <w:lang w:val="en-US" w:eastAsia="zh-TW"/>
+        </w:rPr>
+        <w:t>揚琴</w:t>
+      </w:r>
+      <w:r>
+        <w:rPr>
+          <w:rFonts w:ascii="Noto Serif SC" w:eastAsia="Noto Serif SC" w:hAnsi="Noto Serif SC" w:cs="Noto Serif"/>
+          <w:sz w:val="24"/>
+          <w:szCs w:val="24"/>
+          <w:lang w:val="en-US" w:eastAsia="zh-TW"/>
+        </w:rPr>
+        <w:t xml:space="preserve"> </w:t>
+      </w:r>
+      <w:r>
+        <w:rPr>
+          <w:rFonts w:ascii="Noto Serif SC" w:eastAsia="Noto Serif SC" w:hAnsi="Noto Serif SC" w:cs="Noto Serif"/>
+          <w:sz w:val="24"/>
+          <w:szCs w:val="24"/>
+          <w:lang w:val="en-US" w:eastAsia="zh-TW"/>
+        </w:rPr>
+        <w:t>1</w:t>
+      </w:r>
+      <w:r>
+        <w:rPr>
+          <w:rFonts w:ascii="Noto Serif SC" w:eastAsia="Noto Serif SC" w:hAnsi="Noto Serif SC" w:cs="Noto Serif"/>
+          <w:sz w:val="24"/>
+          <w:szCs w:val="24"/>
+          <w:lang w:val="en-US" w:eastAsia="zh-TW"/>
+        </w:rPr>
+        <w:t xml:space="preserve"> </w:t>
+      </w:r>
+      <w:r>
+        <w:rPr>
+          <w:rFonts w:ascii="Noto Serif SC" w:eastAsia="Noto Serif SC" w:hAnsi="Noto Serif SC" w:cs="Noto Serif"/>
+          <w:sz w:val="24"/>
+          <w:szCs w:val="24"/>
+          <w:lang w:val="en-US" w:eastAsia="zh-TW"/>
+        </w:rPr>
+        <w:t>Yangqin</w:t>
+      </w:r>
+    </w:p>
+    <w:p>
+      <w:pPr>
+        <w:rPr>
+          <w:rFonts w:ascii="Noto Serif SC" w:eastAsia="Noto Serif SC" w:hAnsi="Noto Serif SC" w:cs="Noto Serif"/>
+          <w:sz w:val="24"/>
+          <w:szCs w:val="24"/>
+          <w:lang w:val="en-US"/>
+        </w:rPr>
+      </w:pPr>
+      <w:r>
+        <w:rPr>
+          <w:rFonts w:ascii="Noto Serif SC" w:eastAsia="Noto Serif SC" w:hAnsi="Noto Serif SC" w:cs="Noto Serif"/>
+          <w:sz w:val="24"/>
+          <w:szCs w:val="24"/>
+          <w:lang w:val="en-US" w:eastAsia="zh-TW"/>
+        </w:rPr>
+        <w:t>1</w:t>
+      </w:r>
+      <w:r>
+        <w:rPr>
+          <w:rFonts w:ascii="Noto Serif SC" w:eastAsia="Noto Serif SC" w:hAnsi="Noto Serif SC" w:cs="Noto Serif" w:hint="eastAsia"/>
+          <w:sz w:val="24"/>
+          <w:szCs w:val="24"/>
+          <w:lang w:val="en-US" w:eastAsia="zh-TW"/>
+        </w:rPr>
+        <w:t>柳琴</w:t>
+      </w:r>
+      <w:r>
+        <w:rPr>
+          <w:rFonts w:ascii="Noto Serif SC" w:eastAsia="Noto Serif SC" w:hAnsi="Noto Serif SC" w:cs="Noto Serif"/>
+          <w:sz w:val="24"/>
+          <w:szCs w:val="24"/>
+          <w:lang w:val="en-US" w:eastAsia="zh-TW"/>
+        </w:rPr>
+        <w:t xml:space="preserve"> </w:t>
+      </w:r>
+      <w:r>
+        <w:rPr>
+          <w:rFonts w:ascii="Noto Serif SC" w:eastAsia="Noto Serif SC" w:hAnsi="Noto Serif SC" w:cs="Noto Serif"/>
+          <w:sz w:val="24"/>
+          <w:szCs w:val="24"/>
+          <w:lang w:val="en-US" w:eastAsia="zh-TW"/>
+        </w:rPr>
+        <w:t xml:space="preserve">1 </w:t>
+      </w:r>
       <w:proofErr w:type="spellStart"/>
       <w:r>
         <w:rPr>
@@ -4663,9 +4965,37 @@
           <w:szCs w:val="24"/>
           <w:lang w:val="en-US" w:eastAsia="zh-TW"/>
         </w:rPr>
-        <w:t>Zhongyin</w:t>
+        <w:t>Liuqin</w:t>
       </w:r>
       <w:proofErr w:type="spellEnd"/>
+    </w:p>
+    <w:p>
+      <w:pPr>
+        <w:rPr>
+          <w:rFonts w:ascii="Noto Serif SC" w:eastAsia="Noto Serif SC" w:hAnsi="Noto Serif SC" w:cs="Noto Serif"/>
+          <w:sz w:val="24"/>
+          <w:szCs w:val="24"/>
+          <w:lang w:val="en-US"/>
+        </w:rPr>
+      </w:pPr>
+      <w:r>
+        <w:rPr>
+          <w:rFonts w:ascii="Noto Serif SC" w:eastAsia="Noto Serif SC" w:hAnsi="Noto Serif SC" w:cs="Noto Serif"/>
+          <w:sz w:val="24"/>
+          <w:szCs w:val="24"/>
+          <w:lang w:val="en-US" w:eastAsia="zh-TW"/>
+        </w:rPr>
+        <w:t>4</w:t>
+      </w:r>
+      <w:r>
+        <w:rPr>
+          <w:rFonts w:ascii="Noto Serif SC" w:eastAsia="Noto Serif SC" w:hAnsi="Noto Serif SC" w:cs="Noto Serif" w:hint="eastAsia"/>
+          <w:sz w:val="24"/>
+          <w:szCs w:val="24"/>
+          <w:lang w:val="en-US" w:eastAsia="zh-TW"/>
+        </w:rPr>
+        <w:t>琵琶</w:t>
+      </w:r>
       <w:r>
         <w:rPr>
           <w:rFonts w:ascii="Noto Serif SC" w:eastAsia="Noto Serif SC" w:hAnsi="Noto Serif SC" w:cs="Noto Serif"/>
@@ -4675,17 +5005,24 @@
         </w:rPr>
         <w:t xml:space="preserve"> </w:t>
       </w:r>
-      <w:proofErr w:type="spellStart"/>
-      <w:r>
-        <w:rPr>
-          <w:rFonts w:ascii="Noto Serif SC" w:eastAsia="Noto Serif SC" w:hAnsi="Noto Serif SC" w:cs="Noto Serif"/>
-          <w:sz w:val="24"/>
-          <w:szCs w:val="24"/>
-          <w:lang w:val="en-US" w:eastAsia="zh-TW"/>
-        </w:rPr>
-        <w:t>Suona</w:t>
-      </w:r>
-      <w:proofErr w:type="spellEnd"/>
+      <w:r>
+        <w:rPr>
+          <w:rFonts w:ascii="Noto Serif SC" w:eastAsia="Noto Serif SC" w:hAnsi="Noto Serif SC" w:cs="Noto Serif"/>
+          <w:sz w:val="24"/>
+          <w:szCs w:val="24"/>
+          <w:lang w:val="en-US" w:eastAsia="zh-TW"/>
+        </w:rPr>
+        <w:t xml:space="preserve">4 </w:t>
+      </w:r>
+      <w:r>
+        <w:rPr>
+          <w:rFonts w:ascii="Noto Serif SC" w:eastAsia="Noto Serif SC" w:hAnsi="Noto Serif SC" w:cs="Noto Serif"/>
+          <w:sz w:val="24"/>
+          <w:szCs w:val="24"/>
+          <w:lang w:val="en-US" w:eastAsia="zh-TW"/>
+        </w:rPr>
+        <w:t>Pipa</w:t>
+      </w:r>
     </w:p>
     <w:p>
       <w:pPr>
@@ -4712,7 +5049,7 @@
           <w:szCs w:val="24"/>
           <w:lang w:val="en-US" w:eastAsia="zh-TW"/>
         </w:rPr>
-        <w:t>加鍵次中嗩吶</w:t>
+        <w:t>中阮</w:t>
       </w:r>
       <w:r>
         <w:rPr>
@@ -4730,7 +5067,44 @@
           <w:szCs w:val="24"/>
           <w:lang w:val="en-US" w:eastAsia="zh-TW"/>
         </w:rPr>
-        <w:t>1 Keyed</w:t>
+        <w:t xml:space="preserve">1 </w:t>
+      </w:r>
+      <w:r>
+        <w:rPr>
+          <w:rFonts w:ascii="Noto Serif SC" w:eastAsia="Noto Serif SC" w:hAnsi="Noto Serif SC" w:cs="Noto Serif"/>
+          <w:sz w:val="24"/>
+          <w:szCs w:val="24"/>
+          <w:lang w:val="en-US" w:eastAsia="zh-TW"/>
+        </w:rPr>
+        <w:t>Zhongruan</w:t>
+      </w:r>
+    </w:p>
+    <w:p>
+      <w:pPr>
+        <w:rPr>
+          <w:rFonts w:ascii="Noto Serif SC" w:eastAsia="Noto Serif SC" w:hAnsi="Noto Serif SC" w:cs="Noto Serif"/>
+          <w:sz w:val="24"/>
+          <w:szCs w:val="24"/>
+          <w:lang w:val="en-US"/>
+        </w:rPr>
+      </w:pPr>
+      <w:r>
+        <w:rPr>
+          <w:rFonts w:ascii="Noto Serif SC" w:eastAsia="Noto Serif SC" w:hAnsi="Noto Serif SC" w:cs="Noto Serif"/>
+          <w:sz w:val="24"/>
+          <w:szCs w:val="24"/>
+          <w:lang w:val="en-US" w:eastAsia="zh-TW"/>
+        </w:rPr>
+        <w:t xml:space="preserve">1 </w:t>
+      </w:r>
+      <w:r>
+        <w:rPr>
+          <w:rFonts w:ascii="Noto Serif SC" w:eastAsia="Noto Serif SC" w:hAnsi="Noto Serif SC" w:cs="Noto Serif" w:hint="eastAsia"/>
+          <w:sz w:val="24"/>
+          <w:szCs w:val="24"/>
+          <w:lang w:eastAsia="zh-TW"/>
+        </w:rPr>
+        <w:t>三弦</w:t>
       </w:r>
       <w:r>
         <w:rPr>
@@ -4741,37 +5115,79 @@
         </w:rPr>
         <w:t xml:space="preserve"> </w:t>
       </w:r>
-      <w:proofErr w:type="spellStart"/>
-      <w:r>
-        <w:rPr>
-          <w:rFonts w:ascii="Noto Serif SC" w:eastAsia="Noto Serif SC" w:hAnsi="Noto Serif SC" w:cs="Noto Serif"/>
-          <w:sz w:val="24"/>
-          <w:szCs w:val="24"/>
-          <w:lang w:eastAsia="zh-TW"/>
-        </w:rPr>
-        <w:t>Cizhongyin</w:t>
-      </w:r>
-      <w:proofErr w:type="spellEnd"/>
-      <w:r>
-        <w:rPr>
-          <w:rFonts w:ascii="Noto Serif SC" w:eastAsia="Noto Serif SC" w:hAnsi="Noto Serif SC" w:cs="Noto Serif"/>
-          <w:sz w:val="24"/>
-          <w:szCs w:val="24"/>
-          <w:lang w:eastAsia="zh-TW"/>
+      <w:r>
+        <w:rPr>
+          <w:rFonts w:ascii="Noto Serif SC" w:eastAsia="Noto Serif SC" w:hAnsi="Noto Serif SC" w:cs="Noto Serif"/>
+          <w:sz w:val="24"/>
+          <w:szCs w:val="24"/>
+          <w:lang w:val="en-US" w:eastAsia="zh-TW"/>
+        </w:rPr>
+        <w:t>1 S</w:t>
+      </w:r>
+      <w:r>
+        <w:rPr>
+          <w:rFonts w:ascii="Noto Serif SC" w:eastAsia="Noto Serif SC" w:hAnsi="Noto Serif SC" w:cs="Noto Serif"/>
+          <w:sz w:val="24"/>
+          <w:szCs w:val="24"/>
+          <w:lang w:val="en-US" w:eastAsia="zh-TW"/>
+        </w:rPr>
+        <w:t>anxian</w:t>
+      </w:r>
+    </w:p>
+    <w:p>
+      <w:pPr>
+        <w:rPr>
+          <w:rFonts w:ascii="Noto Serif SC" w:eastAsia="Noto Serif SC" w:hAnsi="Noto Serif SC" w:cs="Noto Serif"/>
+          <w:sz w:val="24"/>
+          <w:szCs w:val="24"/>
+          <w:lang w:val="en-US"/>
+        </w:rPr>
+      </w:pPr>
+      <w:r>
+        <w:rPr>
+          <w:rFonts w:ascii="Noto Serif SC" w:eastAsia="Noto Serif SC" w:hAnsi="Noto Serif SC" w:cs="Noto Serif"/>
+          <w:sz w:val="24"/>
+          <w:szCs w:val="24"/>
+          <w:lang w:val="en-US" w:eastAsia="zh-TW"/>
+        </w:rPr>
+        <w:t xml:space="preserve">1  </w:t>
+      </w:r>
+      <w:r>
+        <w:rPr>
+          <w:rFonts w:ascii="Noto Serif SC" w:eastAsia="Noto Serif SC" w:hAnsi="Noto Serif SC" w:cs="Noto Serif" w:hint="eastAsia"/>
+          <w:sz w:val="24"/>
+          <w:szCs w:val="24"/>
+          <w:lang w:val="en-US" w:eastAsia="zh-TW"/>
+        </w:rPr>
+        <w:t>大阮</w:t>
+      </w:r>
+      <w:r>
+        <w:rPr>
+          <w:rFonts w:ascii="Noto Serif SC" w:eastAsia="Noto Serif SC" w:hAnsi="Noto Serif SC" w:cs="Noto Serif"/>
+          <w:sz w:val="24"/>
+          <w:szCs w:val="24"/>
+          <w:lang w:val="en-US" w:eastAsia="zh-TW"/>
         </w:rPr>
         <w:t xml:space="preserve"> </w:t>
       </w:r>
-      <w:proofErr w:type="spellStart"/>
-      <w:r>
-        <w:rPr>
-          <w:rFonts w:ascii="Noto Serif SC" w:eastAsia="Noto Serif SC" w:hAnsi="Noto Serif SC" w:cs="Noto Serif"/>
-          <w:sz w:val="24"/>
-          <w:szCs w:val="24"/>
-          <w:lang w:val="en-US" w:eastAsia="zh-TW"/>
-        </w:rPr>
-        <w:t>Suona</w:t>
-      </w:r>
-      <w:proofErr w:type="spellEnd"/>
+      <w:r>
+        <w:rPr>
+          <w:rFonts w:ascii="Noto Serif SC" w:eastAsia="Noto Serif SC" w:hAnsi="Noto Serif SC" w:cs="Noto Serif"/>
+          <w:sz w:val="24"/>
+          <w:szCs w:val="24"/>
+          <w:lang w:val="en-US" w:eastAsia="zh-TW"/>
+        </w:rPr>
+        <w:t xml:space="preserve">1 </w:t>
+      </w:r>
+      <w:r>
+        <w:rPr>
+          <w:rFonts w:ascii="Noto Serif SC" w:eastAsia="Noto Serif SC" w:hAnsi="Noto Serif SC" w:cs="Noto Serif"/>
+          <w:sz w:val="24"/>
+          <w:szCs w:val="24"/>
+          <w:lang w:val="en-US" w:eastAsia="zh-TW"/>
+        </w:rPr>
+        <w:t>Daruan</w:t>
+      </w:r>
     </w:p>
     <w:p>
       <w:pPr>
@@ -4789,6 +5205,71 @@
           <w:szCs w:val="24"/>
           <w:lang w:val="en-US" w:eastAsia="zh-TW"/>
         </w:rPr>
+        <w:t xml:space="preserve">1 </w:t>
+      </w:r>
+      <w:r>
+        <w:rPr>
+          <w:rFonts w:ascii="Noto Serif SC" w:eastAsia="Noto Serif SC" w:hAnsi="Noto Serif SC" w:cs="Noto Serif" w:hint="eastAsia"/>
+          <w:sz w:val="24"/>
+          <w:szCs w:val="24"/>
+          <w:lang w:eastAsia="zh-TW"/>
+        </w:rPr>
+        <w:t>古箏</w:t>
+      </w:r>
+      <w:r>
+        <w:rPr>
+          <w:rFonts w:ascii="Noto Serif SC" w:eastAsia="Noto Serif SC" w:hAnsi="Noto Serif SC" w:cs="Noto Serif"/>
+          <w:sz w:val="24"/>
+          <w:szCs w:val="24"/>
+          <w:lang w:val="en-US" w:eastAsia="zh-TW"/>
+        </w:rPr>
+        <w:t xml:space="preserve"> </w:t>
+      </w:r>
+      <w:r>
+        <w:rPr>
+          <w:rFonts w:ascii="Noto Serif SC" w:eastAsia="Noto Serif SC" w:hAnsi="Noto Serif SC" w:cs="Noto Serif"/>
+          <w:sz w:val="24"/>
+          <w:szCs w:val="24"/>
+          <w:lang w:val="en-US" w:eastAsia="zh-TW"/>
+        </w:rPr>
+        <w:t xml:space="preserve">1 </w:t>
+      </w:r>
+      <w:r>
+        <w:rPr>
+          <w:rFonts w:ascii="Noto Serif SC" w:eastAsia="Noto Serif SC" w:hAnsi="Noto Serif SC" w:cs="Noto Serif"/>
+          <w:sz w:val="24"/>
+          <w:szCs w:val="24"/>
+          <w:lang w:val="en-US" w:eastAsia="zh-TW"/>
+        </w:rPr>
+        <w:t>Guzheng</w:t>
+      </w:r>
+    </w:p>
+    <w:p>
+      <w:pPr>
+        <w:rPr>
+          <w:rFonts w:ascii="Noto Serif SC" w:eastAsia="Noto Serif SC" w:hAnsi="Noto Serif SC" w:cs="Noto Serif"/>
+          <w:sz w:val="24"/>
+          <w:szCs w:val="24"/>
+          <w:lang w:val="en-US"/>
+        </w:rPr>
+      </w:pPr>
+    </w:p>
+    <w:p>
+      <w:pPr>
+        <w:rPr>
+          <w:rFonts w:ascii="Noto Serif SC" w:eastAsia="Noto Serif SC" w:hAnsi="Noto Serif SC" w:cs="Noto Serif"/>
+          <w:sz w:val="24"/>
+          <w:szCs w:val="24"/>
+          <w:lang w:val="en-US"/>
+        </w:rPr>
+      </w:pPr>
+      <w:r>
+        <w:rPr>
+          <w:rFonts w:ascii="Noto Serif SC" w:eastAsia="Noto Serif SC" w:hAnsi="Noto Serif SC" w:cs="Noto Serif"/>
+          <w:sz w:val="24"/>
+          <w:szCs w:val="24"/>
+          <w:lang w:val="en-US" w:eastAsia="zh-TW"/>
+        </w:rPr>
         <w:t>1</w:t>
       </w:r>
       <w:r>
@@ -4798,14 +5279,14 @@
           <w:szCs w:val="24"/>
           <w:lang w:eastAsia="zh-TW"/>
         </w:rPr>
-        <w:t>低音嗩吶</w:t>
-      </w:r>
-      <w:r>
-        <w:rPr>
-          <w:rFonts w:ascii="Noto Serif SC" w:eastAsia="Noto Serif SC" w:hAnsi="Noto Serif SC" w:cs="Noto Serif"/>
-          <w:sz w:val="24"/>
-          <w:szCs w:val="24"/>
-          <w:lang w:eastAsia="zh-TW"/>
+        <w:t>定音鼓</w:t>
+      </w:r>
+      <w:r>
+        <w:rPr>
+          <w:rFonts w:ascii="Noto Serif SC" w:eastAsia="Noto Serif SC" w:hAnsi="Noto Serif SC" w:cs="Noto Serif"/>
+          <w:sz w:val="24"/>
+          <w:szCs w:val="24"/>
+          <w:lang w:val="en-US" w:eastAsia="zh-TW"/>
         </w:rPr>
         <w:t xml:space="preserve"> </w:t>
       </w:r>
@@ -4818,37 +5299,15 @@
         </w:rPr>
         <w:t xml:space="preserve">1 </w:t>
       </w:r>
-      <w:proofErr w:type="spellStart"/>
-      <w:r>
-        <w:rPr>
-          <w:rFonts w:ascii="Noto Serif SC" w:eastAsia="Noto Serif SC" w:hAnsi="Noto Serif SC" w:cs="Noto Serif"/>
-          <w:sz w:val="24"/>
-          <w:szCs w:val="24"/>
-          <w:lang w:eastAsia="zh-TW"/>
-        </w:rPr>
-        <w:t>Diyin</w:t>
-      </w:r>
-      <w:proofErr w:type="spellEnd"/>
-      <w:r>
-        <w:rPr>
-          <w:rFonts w:ascii="Noto Serif SC" w:eastAsia="Noto Serif SC" w:hAnsi="Noto Serif SC" w:cs="Noto Serif"/>
-          <w:sz w:val="24"/>
-          <w:szCs w:val="24"/>
-          <w:lang w:eastAsia="zh-TW"/>
-        </w:rPr>
-        <w:t xml:space="preserve"> </w:t>
-      </w:r>
-      <w:proofErr w:type="spellStart"/>
-      <w:r>
-        <w:rPr>
-          <w:rFonts w:ascii="Noto Serif SC" w:eastAsia="Noto Serif SC" w:hAnsi="Noto Serif SC" w:cs="Noto Serif"/>
-          <w:sz w:val="24"/>
-          <w:szCs w:val="24"/>
-          <w:lang w:eastAsia="zh-TW"/>
-        </w:rPr>
-        <w:t>Suona</w:t>
-      </w:r>
-      <w:proofErr w:type="spellEnd"/>
+      <w:r>
+        <w:rPr>
+          <w:rFonts w:ascii="Noto Serif SC" w:eastAsia="Noto Serif SC" w:hAnsi="Noto Serif SC" w:cs="Noto Serif"/>
+          <w:sz w:val="24"/>
+          <w:szCs w:val="24"/>
+          <w:lang w:val="en-US" w:eastAsia="zh-TW"/>
+        </w:rPr>
+        <w:t>Timpani</w:t>
+      </w:r>
     </w:p>
     <w:p>
       <w:pPr>
@@ -4864,582 +5323,56 @@
           <w:rFonts w:ascii="Noto Serif SC" w:eastAsia="Noto Serif SC" w:hAnsi="Noto Serif SC" w:cs="Noto Serif"/>
           <w:sz w:val="24"/>
           <w:szCs w:val="24"/>
-          <w:lang w:val="en-US" w:eastAsia="zh-TW"/>
-        </w:rPr>
-        <w:t>1</w:t>
+        </w:rPr>
+        <w:t>5</w:t>
       </w:r>
       <w:r>
         <w:rPr>
           <w:rFonts w:ascii="Noto Serif SC" w:eastAsia="Noto Serif SC" w:hAnsi="Noto Serif SC" w:cs="Noto Serif" w:hint="eastAsia"/>
           <w:sz w:val="24"/>
           <w:szCs w:val="24"/>
-          <w:lang w:val="en-US" w:eastAsia="zh-TW"/>
-        </w:rPr>
-        <w:t>管</w:t>
-      </w:r>
-      <w:r>
-        <w:rPr>
-          <w:rFonts w:ascii="Noto Serif SC" w:eastAsia="Noto Serif SC" w:hAnsi="Noto Serif SC" w:cs="Noto Serif"/>
-          <w:sz w:val="24"/>
-          <w:szCs w:val="24"/>
-          <w:lang w:val="en-US" w:eastAsia="zh-TW"/>
-        </w:rPr>
-        <w:t xml:space="preserve"> </w:t>
-      </w:r>
-      <w:r>
-        <w:rPr>
-          <w:rFonts w:ascii="Noto Serif SC" w:eastAsia="Noto Serif SC" w:hAnsi="Noto Serif SC" w:cs="Noto Serif"/>
-          <w:sz w:val="24"/>
-          <w:szCs w:val="24"/>
-          <w:lang w:val="en-US" w:eastAsia="zh-TW"/>
-        </w:rPr>
-        <w:t xml:space="preserve">1 </w:t>
-      </w:r>
-      <w:r>
-        <w:rPr>
-          <w:rFonts w:ascii="Noto Serif SC" w:eastAsia="Noto Serif SC" w:hAnsi="Noto Serif SC" w:cs="Noto Serif"/>
-          <w:sz w:val="24"/>
-          <w:szCs w:val="24"/>
-          <w:lang w:val="en-US" w:eastAsia="zh-TW"/>
-        </w:rPr>
-        <w:t>Guan</w:t>
-      </w:r>
-    </w:p>
-    <w:p>
-      <w:pPr>
-        <w:rPr>
-          <w:rFonts w:ascii="Noto Serif SC" w:eastAsia="Noto Serif SC" w:hAnsi="Noto Serif SC" w:cs="Noto Serif"/>
-          <w:sz w:val="24"/>
-          <w:szCs w:val="24"/>
+        </w:rPr>
+        <w:t xml:space="preserve"> 打击乐 </w:t>
+      </w:r>
+      <w:r>
+        <w:rPr>
+          <w:rFonts w:ascii="Noto Serif SC" w:eastAsia="Noto Serif SC" w:hAnsi="Noto Serif SC" w:cs="Noto Serif"/>
+          <w:sz w:val="24"/>
+          <w:szCs w:val="24"/>
+        </w:rPr>
+        <w:t>5</w:t>
+      </w:r>
+      <w:r>
+        <w:rPr>
+          <w:rFonts w:ascii="Noto Serif SC" w:eastAsia="Noto Serif SC" w:hAnsi="Noto Serif SC" w:cs="Noto Serif"/>
+          <w:sz w:val="24"/>
+          <w:szCs w:val="24"/>
+        </w:rPr>
+        <w:t xml:space="preserve"> Percussion</w:t>
+      </w:r>
+    </w:p>
+    <w:p>
+      <w:pPr>
+        <w:ind w:left="288"/>
+        <w:rPr>
+          <w:rFonts w:ascii="Noto Serif SC" w:eastAsia="Noto Serif SC" w:hAnsi="Noto Serif SC" w:cs="Noto Serif"/>
+          <w:sz w:val="20"/>
+          <w:szCs w:val="20"/>
           <w:lang w:val="en-US"/>
         </w:rPr>
       </w:pPr>
-    </w:p>
-    <w:p>
-      <w:pPr>
-        <w:rPr>
-          <w:rFonts w:ascii="Noto Serif SC" w:eastAsia="Noto Serif SC" w:hAnsi="Noto Serif SC" w:cs="Noto Serif"/>
-          <w:sz w:val="24"/>
-          <w:szCs w:val="24"/>
-          <w:lang w:val="en-US"/>
-        </w:rPr>
-      </w:pPr>
-      <w:r>
-        <w:rPr>
-          <w:rFonts w:ascii="Noto Serif SC" w:eastAsia="Noto Serif SC" w:hAnsi="Noto Serif SC" w:cs="Noto Serif"/>
-          <w:sz w:val="24"/>
-          <w:szCs w:val="24"/>
-          <w:lang w:val="en-US" w:eastAsia="zh-TW"/>
-        </w:rPr>
-        <w:t>1</w:t>
+      <w:r>
+        <w:rPr>
+          <w:rFonts w:ascii="Noto Serif SC" w:eastAsia="Noto Serif SC" w:hAnsi="Noto Serif SC" w:cs="Noto Serif"/>
+          <w:sz w:val="20"/>
+          <w:szCs w:val="20"/>
+          <w:lang w:val="en-US" w:eastAsia="zh-TW"/>
+        </w:rPr>
+        <w:t xml:space="preserve">I: </w:t>
       </w:r>
       <w:r>
         <w:rPr>
           <w:rFonts w:ascii="Noto Serif SC" w:eastAsia="Noto Serif SC" w:hAnsi="Noto Serif SC" w:cs="Noto Serif" w:hint="eastAsia"/>
-          <w:sz w:val="24"/>
-          <w:szCs w:val="24"/>
-          <w:lang w:val="en-US" w:eastAsia="zh-TW"/>
-        </w:rPr>
-        <w:t>揚琴</w:t>
-      </w:r>
-      <w:r>
-        <w:rPr>
-          <w:rFonts w:ascii="Noto Serif SC" w:eastAsia="Noto Serif SC" w:hAnsi="Noto Serif SC" w:cs="Noto Serif"/>
-          <w:sz w:val="24"/>
-          <w:szCs w:val="24"/>
-          <w:lang w:val="en-US" w:eastAsia="zh-TW"/>
-        </w:rPr>
-        <w:t xml:space="preserve"> </w:t>
-      </w:r>
-      <w:r>
-        <w:rPr>
-          <w:rFonts w:ascii="Noto Serif SC" w:eastAsia="Noto Serif SC" w:hAnsi="Noto Serif SC" w:cs="Noto Serif"/>
-          <w:sz w:val="24"/>
-          <w:szCs w:val="24"/>
-          <w:lang w:val="en-US" w:eastAsia="zh-TW"/>
-        </w:rPr>
-        <w:t>1</w:t>
-      </w:r>
-      <w:r>
-        <w:rPr>
-          <w:rFonts w:ascii="Noto Serif SC" w:eastAsia="Noto Serif SC" w:hAnsi="Noto Serif SC" w:cs="Noto Serif"/>
-          <w:sz w:val="24"/>
-          <w:szCs w:val="24"/>
-          <w:lang w:val="en-US" w:eastAsia="zh-TW"/>
-        </w:rPr>
-        <w:t xml:space="preserve"> </w:t>
-      </w:r>
-      <w:r>
-        <w:rPr>
-          <w:rFonts w:ascii="Noto Serif SC" w:eastAsia="Noto Serif SC" w:hAnsi="Noto Serif SC" w:cs="Noto Serif"/>
-          <w:sz w:val="24"/>
-          <w:szCs w:val="24"/>
-          <w:lang w:val="en-US" w:eastAsia="zh-TW"/>
-        </w:rPr>
-        <w:t>Yangqin</w:t>
-      </w:r>
-    </w:p>
-    <w:p>
-      <w:pPr>
-        <w:rPr>
-          <w:rFonts w:ascii="Noto Serif SC" w:eastAsia="Noto Serif SC" w:hAnsi="Noto Serif SC" w:cs="Noto Serif"/>
-          <w:sz w:val="24"/>
-          <w:szCs w:val="24"/>
-          <w:lang w:val="en-US"/>
-        </w:rPr>
-      </w:pPr>
-      <w:r>
-        <w:rPr>
-          <w:rFonts w:ascii="Noto Serif SC" w:eastAsia="Noto Serif SC" w:hAnsi="Noto Serif SC" w:cs="Noto Serif"/>
-          <w:sz w:val="24"/>
-          <w:szCs w:val="24"/>
-          <w:lang w:val="en-US" w:eastAsia="zh-TW"/>
-        </w:rPr>
-        <w:t>1</w:t>
-      </w:r>
-      <w:r>
-        <w:rPr>
-          <w:rFonts w:ascii="Noto Serif SC" w:eastAsia="Noto Serif SC" w:hAnsi="Noto Serif SC" w:cs="Noto Serif" w:hint="eastAsia"/>
-          <w:sz w:val="24"/>
-          <w:szCs w:val="24"/>
-          <w:lang w:val="en-US" w:eastAsia="zh-TW"/>
-        </w:rPr>
-        <w:t>柳琴</w:t>
-      </w:r>
-      <w:r>
-        <w:rPr>
-          <w:rFonts w:ascii="Noto Serif SC" w:eastAsia="Noto Serif SC" w:hAnsi="Noto Serif SC" w:cs="Noto Serif"/>
-          <w:sz w:val="24"/>
-          <w:szCs w:val="24"/>
-          <w:lang w:val="en-US" w:eastAsia="zh-TW"/>
-        </w:rPr>
-        <w:t xml:space="preserve"> </w:t>
-      </w:r>
-      <w:r>
-        <w:rPr>
-          <w:rFonts w:ascii="Noto Serif SC" w:eastAsia="Noto Serif SC" w:hAnsi="Noto Serif SC" w:cs="Noto Serif"/>
-          <w:sz w:val="24"/>
-          <w:szCs w:val="24"/>
-          <w:lang w:val="en-US" w:eastAsia="zh-TW"/>
-        </w:rPr>
-        <w:t xml:space="preserve">1 </w:t>
-      </w:r>
-      <w:proofErr w:type="spellStart"/>
-      <w:r>
-        <w:rPr>
-          <w:rFonts w:ascii="Noto Serif SC" w:eastAsia="Noto Serif SC" w:hAnsi="Noto Serif SC" w:cs="Noto Serif"/>
-          <w:sz w:val="24"/>
-          <w:szCs w:val="24"/>
-          <w:lang w:val="en-US" w:eastAsia="zh-TW"/>
-        </w:rPr>
-        <w:t>Liuqin</w:t>
-      </w:r>
-      <w:proofErr w:type="spellEnd"/>
-    </w:p>
-    <w:p>
-      <w:pPr>
-        <w:rPr>
-          <w:rFonts w:ascii="Noto Serif SC" w:eastAsia="Noto Serif SC" w:hAnsi="Noto Serif SC" w:cs="Noto Serif"/>
-          <w:sz w:val="24"/>
-          <w:szCs w:val="24"/>
-          <w:lang w:val="en-US"/>
-        </w:rPr>
-      </w:pPr>
-      <w:r>
-        <w:rPr>
-          <w:rFonts w:ascii="Noto Serif SC" w:eastAsia="Noto Serif SC" w:hAnsi="Noto Serif SC" w:cs="Noto Serif"/>
-          <w:sz w:val="24"/>
-          <w:szCs w:val="24"/>
-          <w:lang w:val="en-US" w:eastAsia="zh-TW"/>
-        </w:rPr>
-        <w:t>4</w:t>
-      </w:r>
-      <w:r>
-        <w:rPr>
-          <w:rFonts w:ascii="Noto Serif SC" w:eastAsia="Noto Serif SC" w:hAnsi="Noto Serif SC" w:cs="Noto Serif" w:hint="eastAsia"/>
-          <w:sz w:val="24"/>
-          <w:szCs w:val="24"/>
-          <w:lang w:val="en-US" w:eastAsia="zh-TW"/>
-        </w:rPr>
-        <w:t>琵琶</w:t>
-      </w:r>
-      <w:r>
-        <w:rPr>
-          <w:rFonts w:ascii="Noto Serif SC" w:eastAsia="Noto Serif SC" w:hAnsi="Noto Serif SC" w:cs="Noto Serif"/>
-          <w:sz w:val="24"/>
-          <w:szCs w:val="24"/>
-          <w:lang w:val="en-US" w:eastAsia="zh-TW"/>
-        </w:rPr>
-        <w:t xml:space="preserve"> </w:t>
-      </w:r>
-      <w:r>
-        <w:rPr>
-          <w:rFonts w:ascii="Noto Serif SC" w:eastAsia="Noto Serif SC" w:hAnsi="Noto Serif SC" w:cs="Noto Serif"/>
-          <w:sz w:val="24"/>
-          <w:szCs w:val="24"/>
-          <w:lang w:val="en-US" w:eastAsia="zh-TW"/>
-        </w:rPr>
-        <w:t xml:space="preserve">4 </w:t>
-      </w:r>
-      <w:r>
-        <w:rPr>
-          <w:rFonts w:ascii="Noto Serif SC" w:eastAsia="Noto Serif SC" w:hAnsi="Noto Serif SC" w:cs="Noto Serif"/>
-          <w:sz w:val="24"/>
-          <w:szCs w:val="24"/>
-          <w:lang w:val="en-US" w:eastAsia="zh-TW"/>
-        </w:rPr>
-        <w:t>Pipa</w:t>
-      </w:r>
-    </w:p>
-    <w:p>
-      <w:pPr>
-        <w:rPr>
-          <w:rFonts w:ascii="Noto Serif SC" w:eastAsia="Noto Serif SC" w:hAnsi="Noto Serif SC" w:cs="Noto Serif"/>
-          <w:sz w:val="24"/>
-          <w:szCs w:val="24"/>
-          <w:lang w:val="en-US"/>
-        </w:rPr>
-      </w:pPr>
-      <w:r>
-        <w:rPr>
-          <w:rFonts w:ascii="Noto Serif SC" w:eastAsia="Noto Serif SC" w:hAnsi="Noto Serif SC" w:cs="Noto Serif"/>
-          <w:sz w:val="24"/>
-          <w:szCs w:val="24"/>
-          <w:lang w:val="en-US" w:eastAsia="zh-TW"/>
-        </w:rPr>
-        <w:t>1</w:t>
-      </w:r>
-      <w:r>
-        <w:rPr>
-          <w:rFonts w:ascii="Noto Serif SC" w:eastAsia="Noto Serif SC" w:hAnsi="Noto Serif SC" w:cs="Noto Serif" w:hint="eastAsia"/>
-          <w:sz w:val="24"/>
-          <w:szCs w:val="24"/>
-          <w:lang w:val="en-US" w:eastAsia="zh-TW"/>
-        </w:rPr>
-        <w:t>中阮</w:t>
-      </w:r>
-      <w:r>
-        <w:rPr>
-          <w:rFonts w:ascii="Noto Serif SC" w:eastAsia="Noto Serif SC" w:hAnsi="Noto Serif SC" w:cs="Noto Serif"/>
-          <w:sz w:val="24"/>
-          <w:szCs w:val="24"/>
-          <w:lang w:val="en-US" w:eastAsia="zh-TW"/>
-        </w:rPr>
-        <w:t xml:space="preserve"> </w:t>
-      </w:r>
-      <w:r>
-        <w:rPr>
-          <w:rFonts w:ascii="Noto Serif SC" w:eastAsia="Noto Serif SC" w:hAnsi="Noto Serif SC" w:cs="Noto Serif"/>
-          <w:sz w:val="24"/>
-          <w:szCs w:val="24"/>
-          <w:lang w:val="en-US" w:eastAsia="zh-TW"/>
-        </w:rPr>
-        <w:t xml:space="preserve">1 </w:t>
-      </w:r>
-      <w:r>
-        <w:rPr>
-          <w:rFonts w:ascii="Noto Serif SC" w:eastAsia="Noto Serif SC" w:hAnsi="Noto Serif SC" w:cs="Noto Serif"/>
-          <w:sz w:val="24"/>
-          <w:szCs w:val="24"/>
-          <w:lang w:val="en-US" w:eastAsia="zh-TW"/>
-        </w:rPr>
-        <w:t>Zhongruan</w:t>
-      </w:r>
-    </w:p>
-    <w:p>
-      <w:pPr>
-        <w:rPr>
-          <w:rFonts w:ascii="Noto Serif SC" w:eastAsia="Noto Serif SC" w:hAnsi="Noto Serif SC" w:cs="Noto Serif"/>
-          <w:sz w:val="24"/>
-          <w:szCs w:val="24"/>
-          <w:lang w:val="en-US"/>
-        </w:rPr>
-      </w:pPr>
-      <w:r>
-        <w:rPr>
-          <w:rFonts w:ascii="Noto Serif SC" w:eastAsia="Noto Serif SC" w:hAnsi="Noto Serif SC" w:cs="Noto Serif"/>
-          <w:sz w:val="24"/>
-          <w:szCs w:val="24"/>
-          <w:lang w:val="en-US" w:eastAsia="zh-TW"/>
-        </w:rPr>
-        <w:t xml:space="preserve">1 </w:t>
-      </w:r>
-      <w:r>
-        <w:rPr>
-          <w:rFonts w:ascii="Noto Serif SC" w:eastAsia="Noto Serif SC" w:hAnsi="Noto Serif SC" w:cs="Noto Serif" w:hint="eastAsia"/>
-          <w:sz w:val="24"/>
-          <w:szCs w:val="24"/>
-          <w:lang w:eastAsia="zh-TW"/>
-        </w:rPr>
-        <w:t>三弦</w:t>
-      </w:r>
-      <w:r>
-        <w:rPr>
-          <w:rFonts w:ascii="Noto Serif SC" w:eastAsia="Noto Serif SC" w:hAnsi="Noto Serif SC" w:cs="Noto Serif"/>
-          <w:sz w:val="24"/>
-          <w:szCs w:val="24"/>
-          <w:lang w:val="en-US" w:eastAsia="zh-TW"/>
-        </w:rPr>
-        <w:t xml:space="preserve"> </w:t>
-      </w:r>
-      <w:r>
-        <w:rPr>
-          <w:rFonts w:ascii="Noto Serif SC" w:eastAsia="Noto Serif SC" w:hAnsi="Noto Serif SC" w:cs="Noto Serif"/>
-          <w:sz w:val="24"/>
-          <w:szCs w:val="24"/>
-          <w:lang w:val="en-US" w:eastAsia="zh-TW"/>
-        </w:rPr>
-        <w:t>1 S</w:t>
-      </w:r>
-      <w:r>
-        <w:rPr>
-          <w:rFonts w:ascii="Noto Serif SC" w:eastAsia="Noto Serif SC" w:hAnsi="Noto Serif SC" w:cs="Noto Serif"/>
-          <w:sz w:val="24"/>
-          <w:szCs w:val="24"/>
-          <w:lang w:val="en-US" w:eastAsia="zh-TW"/>
-        </w:rPr>
-        <w:t>anxian</w:t>
-      </w:r>
-    </w:p>
-    <w:p>
-      <w:pPr>
-        <w:rPr>
-          <w:rFonts w:ascii="Noto Serif SC" w:eastAsia="Noto Serif SC" w:hAnsi="Noto Serif SC" w:cs="Noto Serif"/>
-          <w:sz w:val="24"/>
-          <w:szCs w:val="24"/>
-          <w:lang w:val="en-US"/>
-        </w:rPr>
-      </w:pPr>
-      <w:r>
-        <w:rPr>
-          <w:rFonts w:ascii="Noto Serif SC" w:eastAsia="Noto Serif SC" w:hAnsi="Noto Serif SC" w:cs="Noto Serif"/>
-          <w:sz w:val="24"/>
-          <w:szCs w:val="24"/>
-          <w:lang w:val="en-US" w:eastAsia="zh-TW"/>
-        </w:rPr>
-        <w:t xml:space="preserve">1  </w:t>
-      </w:r>
-      <w:r>
-        <w:rPr>
-          <w:rFonts w:ascii="Noto Serif SC" w:eastAsia="Noto Serif SC" w:hAnsi="Noto Serif SC" w:cs="Noto Serif" w:hint="eastAsia"/>
-          <w:sz w:val="24"/>
-          <w:szCs w:val="24"/>
-          <w:lang w:val="en-US" w:eastAsia="zh-TW"/>
-        </w:rPr>
-        <w:t>大阮</w:t>
-      </w:r>
-      <w:r>
-        <w:rPr>
-          <w:rFonts w:ascii="Noto Serif SC" w:eastAsia="Noto Serif SC" w:hAnsi="Noto Serif SC" w:cs="Noto Serif"/>
-          <w:sz w:val="24"/>
-          <w:szCs w:val="24"/>
-          <w:lang w:val="en-US" w:eastAsia="zh-TW"/>
-        </w:rPr>
-        <w:t xml:space="preserve"> </w:t>
-      </w:r>
-      <w:r>
-        <w:rPr>
-          <w:rFonts w:ascii="Noto Serif SC" w:eastAsia="Noto Serif SC" w:hAnsi="Noto Serif SC" w:cs="Noto Serif"/>
-          <w:sz w:val="24"/>
-          <w:szCs w:val="24"/>
-          <w:lang w:val="en-US" w:eastAsia="zh-TW"/>
-        </w:rPr>
-        <w:t xml:space="preserve">1 </w:t>
-      </w:r>
-      <w:r>
-        <w:rPr>
-          <w:rFonts w:ascii="Noto Serif SC" w:eastAsia="Noto Serif SC" w:hAnsi="Noto Serif SC" w:cs="Noto Serif"/>
-          <w:sz w:val="24"/>
-          <w:szCs w:val="24"/>
-          <w:lang w:val="en-US" w:eastAsia="zh-TW"/>
-        </w:rPr>
-        <w:t>Daruan</w:t>
-      </w:r>
-    </w:p>
-    <w:p>
-      <w:pPr>
-        <w:rPr>
-          <w:rFonts w:ascii="Noto Serif SC" w:eastAsia="Noto Serif SC" w:hAnsi="Noto Serif SC" w:cs="Noto Serif"/>
-          <w:sz w:val="24"/>
-          <w:szCs w:val="24"/>
-          <w:lang w:val="en-US"/>
-        </w:rPr>
-      </w:pPr>
-      <w:r>
-        <w:rPr>
-          <w:rFonts w:ascii="Noto Serif SC" w:eastAsia="Noto Serif SC" w:hAnsi="Noto Serif SC" w:cs="Noto Serif"/>
-          <w:sz w:val="24"/>
-          <w:szCs w:val="24"/>
-          <w:lang w:val="en-US" w:eastAsia="zh-TW"/>
-        </w:rPr>
-        <w:t xml:space="preserve">1 </w:t>
-      </w:r>
-      <w:r>
-        <w:rPr>
-          <w:rFonts w:ascii="Noto Serif SC" w:eastAsia="Noto Serif SC" w:hAnsi="Noto Serif SC" w:cs="Noto Serif" w:hint="eastAsia"/>
-          <w:sz w:val="24"/>
-          <w:szCs w:val="24"/>
-          <w:lang w:eastAsia="zh-TW"/>
-        </w:rPr>
-        <w:t>古箏</w:t>
-      </w:r>
-      <w:r>
-        <w:rPr>
-          <w:rFonts w:ascii="Noto Serif SC" w:eastAsia="Noto Serif SC" w:hAnsi="Noto Serif SC" w:cs="Noto Serif"/>
-          <w:sz w:val="24"/>
-          <w:szCs w:val="24"/>
-          <w:lang w:val="en-US" w:eastAsia="zh-TW"/>
-        </w:rPr>
-        <w:t xml:space="preserve"> </w:t>
-      </w:r>
-      <w:r>
-        <w:rPr>
-          <w:rFonts w:ascii="Noto Serif SC" w:eastAsia="Noto Serif SC" w:hAnsi="Noto Serif SC" w:cs="Noto Serif"/>
-          <w:sz w:val="24"/>
-          <w:szCs w:val="24"/>
-          <w:lang w:val="en-US" w:eastAsia="zh-TW"/>
-        </w:rPr>
-        <w:t xml:space="preserve">1 </w:t>
-      </w:r>
-      <w:r>
-        <w:rPr>
-          <w:rFonts w:ascii="Noto Serif SC" w:eastAsia="Noto Serif SC" w:hAnsi="Noto Serif SC" w:cs="Noto Serif"/>
-          <w:sz w:val="24"/>
-          <w:szCs w:val="24"/>
-          <w:lang w:val="en-US" w:eastAsia="zh-TW"/>
-        </w:rPr>
-        <w:t>Guzheng</w:t>
-      </w:r>
-    </w:p>
-    <w:p>
-      <w:pPr>
-        <w:rPr>
-          <w:rFonts w:ascii="Noto Serif SC" w:eastAsia="Noto Serif SC" w:hAnsi="Noto Serif SC" w:cs="Noto Serif"/>
-          <w:sz w:val="24"/>
-          <w:szCs w:val="24"/>
-          <w:lang w:val="en-US"/>
-        </w:rPr>
-      </w:pPr>
-    </w:p>
-    <w:p>
-      <w:pPr>
-        <w:rPr>
-          <w:rFonts w:ascii="Noto Serif SC" w:eastAsia="Noto Serif SC" w:hAnsi="Noto Serif SC" w:cs="Noto Serif"/>
-          <w:sz w:val="24"/>
-          <w:szCs w:val="24"/>
-          <w:lang w:val="en-US"/>
-        </w:rPr>
-      </w:pPr>
-      <w:r>
-        <w:rPr>
-          <w:rFonts w:ascii="Noto Serif SC" w:eastAsia="Noto Serif SC" w:hAnsi="Noto Serif SC" w:cs="Noto Serif"/>
-          <w:sz w:val="24"/>
-          <w:szCs w:val="24"/>
-          <w:lang w:val="en-US" w:eastAsia="zh-TW"/>
-        </w:rPr>
-        <w:t>1</w:t>
-      </w:r>
-      <w:r>
-        <w:rPr>
-          <w:rFonts w:ascii="Noto Serif SC" w:eastAsia="Noto Serif SC" w:hAnsi="Noto Serif SC" w:cs="Noto Serif" w:hint="eastAsia"/>
-          <w:sz w:val="24"/>
-          <w:szCs w:val="24"/>
-          <w:lang w:eastAsia="zh-TW"/>
-        </w:rPr>
-        <w:t>定音鼓</w:t>
-      </w:r>
-      <w:r>
-        <w:rPr>
-          <w:rFonts w:ascii="Noto Serif SC" w:eastAsia="Noto Serif SC" w:hAnsi="Noto Serif SC" w:cs="Noto Serif"/>
-          <w:sz w:val="24"/>
-          <w:szCs w:val="24"/>
-          <w:lang w:val="en-US" w:eastAsia="zh-TW"/>
-        </w:rPr>
-        <w:t xml:space="preserve"> </w:t>
-      </w:r>
-      <w:r>
-        <w:rPr>
-          <w:rFonts w:ascii="Noto Serif SC" w:eastAsia="Noto Serif SC" w:hAnsi="Noto Serif SC" w:cs="Noto Serif"/>
-          <w:sz w:val="24"/>
-          <w:szCs w:val="24"/>
-          <w:lang w:val="en-US" w:eastAsia="zh-TW"/>
-        </w:rPr>
-        <w:t xml:space="preserve">1 </w:t>
-      </w:r>
-      <w:r>
-        <w:rPr>
-          <w:rFonts w:ascii="Noto Serif SC" w:eastAsia="Noto Serif SC" w:hAnsi="Noto Serif SC" w:cs="Noto Serif"/>
-          <w:sz w:val="24"/>
-          <w:szCs w:val="24"/>
-          <w:lang w:val="en-US" w:eastAsia="zh-TW"/>
-        </w:rPr>
-        <w:t>Timpani</w:t>
-      </w:r>
-    </w:p>
-    <w:p>
-      <w:pPr>
-        <w:rPr>
-          <w:rFonts w:ascii="Noto Serif SC" w:eastAsia="Noto Serif SC" w:hAnsi="Noto Serif SC" w:cs="Noto Serif"/>
-          <w:sz w:val="24"/>
-          <w:szCs w:val="24"/>
-          <w:lang w:val="en-US"/>
-        </w:rPr>
-      </w:pPr>
-      <w:r>
-        <w:rPr>
-          <w:rFonts w:ascii="Noto Serif SC" w:eastAsia="Noto Serif SC" w:hAnsi="Noto Serif SC" w:cs="Noto Serif"/>
-          <w:sz w:val="24"/>
-          <w:szCs w:val="24"/>
-        </w:rPr>
-        <w:t>5</w:t>
-      </w:r>
-      <w:r>
-        <w:rPr>
-          <w:rFonts w:ascii="Noto Serif SC" w:eastAsia="Noto Serif SC" w:hAnsi="Noto Serif SC" w:cs="Noto Serif" w:hint="eastAsia"/>
-          <w:sz w:val="24"/>
-          <w:szCs w:val="24"/>
-        </w:rPr>
-        <w:t xml:space="preserve"> 打击乐 </w:t>
-      </w:r>
-      <w:r>
-        <w:rPr>
-          <w:rFonts w:ascii="Noto Serif SC" w:eastAsia="Noto Serif SC" w:hAnsi="Noto Serif SC" w:cs="Noto Serif"/>
-          <w:sz w:val="24"/>
-          <w:szCs w:val="24"/>
-        </w:rPr>
-        <w:t>5</w:t>
-      </w:r>
-      <w:r>
-        <w:rPr>
-          <w:rFonts w:ascii="Noto Serif SC" w:eastAsia="Noto Serif SC" w:hAnsi="Noto Serif SC" w:cs="Noto Serif"/>
-          <w:sz w:val="24"/>
-          <w:szCs w:val="24"/>
-        </w:rPr>
-        <w:t xml:space="preserve"> Percussion</w:t>
-      </w:r>
-    </w:p>
-    <w:p>
-      <w:pPr>
-        <w:ind w:left="288"/>
-        <w:rPr>
-          <w:rFonts w:ascii="Noto Serif SC" w:eastAsia="Noto Serif SC" w:hAnsi="Noto Serif SC" w:cs="Noto Serif"/>
-          <w:sz w:val="20"/>
-          <w:szCs w:val="20"/>
-          <w:lang w:val="en-US"/>
-        </w:rPr>
-      </w:pPr>
-      <w:r>
-        <w:rPr>
-          <w:rFonts w:ascii="Noto Serif SC" w:eastAsia="Noto Serif SC" w:hAnsi="Noto Serif SC" w:cs="Noto Serif"/>
-          <w:sz w:val="20"/>
-          <w:szCs w:val="20"/>
-          <w:lang w:val="en-US" w:eastAsia="zh-TW"/>
-        </w:rPr>
-        <w:t xml:space="preserve">I: </w:t>
-      </w:r>
-      <w:r>
-        <w:rPr>
-          <w:rFonts w:ascii="Noto Serif SC" w:eastAsia="Noto Serif SC" w:hAnsi="Noto Serif SC" w:cs="Noto Serif" w:hint="eastAsia"/>
           <w:sz w:val="20"/>
           <w:szCs w:val="20"/>
           <w:lang w:eastAsia="zh-TW"/>
@@ -5453,27 +5386,7 @@
           <w:szCs w:val="20"/>
           <w:lang w:eastAsia="zh-TW"/>
         </w:rPr>
-        <w:t xml:space="preserve"> </w:t>
-      </w:r>
-      <w:proofErr w:type="spellStart"/>
-      <w:r>
-        <w:rPr>
-          <w:rFonts w:ascii="Noto Serif SC" w:eastAsia="Noto Serif SC" w:hAnsi="Noto Serif SC" w:cs="Noto Serif"/>
-          <w:sz w:val="20"/>
-          <w:szCs w:val="20"/>
-          <w:lang w:eastAsia="zh-TW"/>
-        </w:rPr>
-        <w:t>Dagu</w:t>
-      </w:r>
-      <w:proofErr w:type="spellEnd"/>
-      <w:r>
-        <w:rPr>
-          <w:rFonts w:ascii="Noto Serif SC" w:eastAsia="Noto Serif SC" w:hAnsi="Noto Serif SC" w:cs="Noto Serif"/>
-          <w:sz w:val="20"/>
-          <w:szCs w:val="20"/>
-          <w:lang w:eastAsia="zh-TW"/>
-        </w:rPr>
-        <w:t xml:space="preserve">, </w:t>
+        <w:t xml:space="preserve"> Dagu, </w:t>
       </w:r>
       <w:r>
         <w:rPr>

</xml_diff>

<commit_message>
Piece 2 and 7 Suona issue fixed (score and front matter)
</commit_message>
<xml_diff>
--- a/Front Matter/Template/2_Front-Matter.docx
+++ b/Front Matter/Template/2_Front-Matter.docx
@@ -2629,7 +2629,23 @@
           <w:rFonts w:ascii="Noto Serif SC" w:eastAsia="Noto Serif SC" w:hAnsi="Noto Serif SC"/>
           <w:lang w:eastAsia="zh-TW"/>
         </w:rPr>
-        <w:t>Salvatore Martirano Memorial Composition Award</w:t>
+        <w:t xml:space="preserve">Salvatore </w:t>
+      </w:r>
+      <w:proofErr w:type="spellStart"/>
+      <w:r>
+        <w:rPr>
+          <w:rFonts w:ascii="Noto Serif SC" w:eastAsia="Noto Serif SC" w:hAnsi="Noto Serif SC"/>
+          <w:lang w:eastAsia="zh-TW"/>
+        </w:rPr>
+        <w:t>Martirano</w:t>
+      </w:r>
+      <w:proofErr w:type="spellEnd"/>
+      <w:r>
+        <w:rPr>
+          <w:rFonts w:ascii="Noto Serif SC" w:eastAsia="Noto Serif SC" w:hAnsi="Noto Serif SC"/>
+          <w:lang w:eastAsia="zh-TW"/>
+        </w:rPr>
+        <w:t xml:space="preserve"> Memorial Composition Award</w:t>
       </w:r>
       <w:r>
         <w:rPr>
@@ -4665,7 +4681,25 @@
           <w:szCs w:val="24"/>
           <w:lang w:val="en-US" w:eastAsia="zh-TW"/>
         </w:rPr>
-        <w:t>次中嗩吶</w:t>
+        <w:t>次中</w:t>
+      </w:r>
+      <w:r>
+        <w:rPr>
+          <w:rFonts w:ascii="Noto Serif SC" w:eastAsia="Noto Serif SC" w:hAnsi="Noto Serif SC" w:cs="Noto Serif" w:hint="eastAsia"/>
+          <w:sz w:val="24"/>
+          <w:szCs w:val="24"/>
+          <w:lang w:val="en-US" w:eastAsia="zh-TW"/>
+        </w:rPr>
+        <w:t>音</w:t>
+      </w:r>
+      <w:r>
+        <w:rPr>
+          <w:rFonts w:ascii="Noto Serif SC" w:eastAsia="Noto Serif SC" w:hAnsi="Noto Serif SC" w:cs="Noto Serif" w:hint="eastAsia"/>
+          <w:sz w:val="24"/>
+          <w:szCs w:val="24"/>
+          <w:lang w:val="en-US" w:eastAsia="zh-TW"/>
+        </w:rPr>
+        <w:t>嗩吶</w:t>
       </w:r>
       <w:r>
         <w:rPr>
@@ -4762,15 +4796,6 @@
         </w:rPr>
         <w:t xml:space="preserve">1 </w:t>
       </w:r>
-      <w:r>
-        <w:rPr>
-          <w:rFonts w:ascii="Noto Serif SC" w:eastAsia="Noto Serif SC" w:hAnsi="Noto Serif SC" w:cs="Noto Serif"/>
-          <w:sz w:val="24"/>
-          <w:szCs w:val="24"/>
-          <w:lang w:eastAsia="zh-TW"/>
-        </w:rPr>
-        <w:t xml:space="preserve">Diyin </w:t>
-      </w:r>
       <w:proofErr w:type="spellStart"/>
       <w:r>
         <w:rPr>
@@ -4779,6 +4804,26 @@
           <w:szCs w:val="24"/>
           <w:lang w:eastAsia="zh-TW"/>
         </w:rPr>
+        <w:t>Diyin</w:t>
+      </w:r>
+      <w:proofErr w:type="spellEnd"/>
+      <w:r>
+        <w:rPr>
+          <w:rFonts w:ascii="Noto Serif SC" w:eastAsia="Noto Serif SC" w:hAnsi="Noto Serif SC" w:cs="Noto Serif"/>
+          <w:sz w:val="24"/>
+          <w:szCs w:val="24"/>
+          <w:lang w:eastAsia="zh-TW"/>
+        </w:rPr>
+        <w:t xml:space="preserve"> </w:t>
+      </w:r>
+      <w:proofErr w:type="spellStart"/>
+      <w:r>
+        <w:rPr>
+          <w:rFonts w:ascii="Noto Serif SC" w:eastAsia="Noto Serif SC" w:hAnsi="Noto Serif SC" w:cs="Noto Serif"/>
+          <w:sz w:val="24"/>
+          <w:szCs w:val="24"/>
+          <w:lang w:eastAsia="zh-TW"/>
+        </w:rPr>
         <w:t>Suona</w:t>
       </w:r>
       <w:proofErr w:type="spellEnd"/>
@@ -5386,7 +5431,27 @@
           <w:szCs w:val="20"/>
           <w:lang w:eastAsia="zh-TW"/>
         </w:rPr>
-        <w:t xml:space="preserve"> Dagu, </w:t>
+        <w:t xml:space="preserve"> </w:t>
+      </w:r>
+      <w:proofErr w:type="spellStart"/>
+      <w:r>
+        <w:rPr>
+          <w:rFonts w:ascii="Noto Serif SC" w:eastAsia="Noto Serif SC" w:hAnsi="Noto Serif SC" w:cs="Noto Serif"/>
+          <w:sz w:val="20"/>
+          <w:szCs w:val="20"/>
+          <w:lang w:eastAsia="zh-TW"/>
+        </w:rPr>
+        <w:t>Dagu</w:t>
+      </w:r>
+      <w:proofErr w:type="spellEnd"/>
+      <w:r>
+        <w:rPr>
+          <w:rFonts w:ascii="Noto Serif SC" w:eastAsia="Noto Serif SC" w:hAnsi="Noto Serif SC" w:cs="Noto Serif"/>
+          <w:sz w:val="20"/>
+          <w:szCs w:val="20"/>
+          <w:lang w:eastAsia="zh-TW"/>
+        </w:rPr>
+        <w:t xml:space="preserve">, </w:t>
       </w:r>
       <w:r>
         <w:rPr>

</xml_diff>